<commit_message>
Estructura de Datos Proceso 3_1
</commit_message>
<xml_diff>
--- a/3er Semestre/Estructura de Datos/Proceso3.1/Proceso3_1.docx
+++ b/3er Semestre/Estructura de Datos/Proceso3.1/Proceso3_1.docx
@@ -7,12 +7,14 @@
         <w:rPr>
           <w:b/>
           <w:bCs/>
+          <w:lang w:val="en-US"/>
         </w:rPr>
       </w:pPr>
       <w:r>
         <w:rPr>
           <w:b/>
           <w:bCs/>
+          <w:lang w:val="en-US"/>
         </w:rPr>
         <w:t>Ejemplo 1</w:t>
       </w:r>
@@ -120,37 +122,18 @@
       </w:r>
     </w:p>
     <w:p>
-      <w:pPr>
-        <w:rPr>
-          <w:lang w:val="en-US"/>
-        </w:rPr>
-      </w:pPr>
-      <w:r>
-        <w:rPr>
-          <w:lang w:val="en-US"/>
-        </w:rPr>
-        <w:t xml:space="preserve">    string </w:t>
-      </w:r>
-      <w:proofErr w:type="spellStart"/>
-      <w:r>
-        <w:rPr>
-          <w:lang w:val="en-US"/>
-        </w:rPr>
-        <w:t>nombre</w:t>
-      </w:r>
-      <w:proofErr w:type="spellEnd"/>
-      <w:r>
-        <w:rPr>
-          <w:lang w:val="en-US"/>
-        </w:rPr>
-        <w:t>;</w:t>
-      </w:r>
-    </w:p>
-    <w:p>
-      <w:r>
-        <w:rPr>
-          <w:lang w:val="en-US"/>
-        </w:rPr>
+      <w:r>
+        <w:rPr>
+          <w:lang w:val="en-US"/>
+        </w:rPr>
+        <w:t xml:space="preserve">    </w:t>
+      </w:r>
+      <w:r>
+        <w:t>string nombre;</w:t>
+      </w:r>
+    </w:p>
+    <w:p>
+      <w:r>
         <w:t xml:space="preserve">    </w:t>
       </w:r>
       <w:proofErr w:type="spellStart"/>
@@ -1018,6 +1001,9 @@
     </w:p>
     <w:p>
       <w:r>
+        <w:rPr>
+          <w:noProof/>
+        </w:rPr>
         <w:drawing>
           <wp:inline distT="0" distB="0" distL="0" distR="0" wp14:anchorId="3D9A409C" wp14:editId="734D8687">
             <wp:extent cx="5400040" cy="2351405"/>
@@ -1227,6 +1213,1176 @@
           <w:bCs/>
         </w:rPr>
       </w:pPr>
+      <w:r>
+        <w:rPr>
+          <w:b/>
+          <w:bCs/>
+        </w:rPr>
+        <w:lastRenderedPageBreak/>
+        <w:t>// Ejercicio sobre un Banco</w:t>
+      </w:r>
+    </w:p>
+    <w:p>
+      <w:r>
+        <w:t>#include&lt;iostream&gt;</w:t>
+      </w:r>
+    </w:p>
+    <w:p>
+      <w:pPr>
+        <w:rPr>
+          <w:lang w:val="en-US"/>
+        </w:rPr>
+      </w:pPr>
+      <w:r>
+        <w:rPr>
+          <w:lang w:val="en-US"/>
+        </w:rPr>
+        <w:t>#include&lt;string&gt;</w:t>
+      </w:r>
+    </w:p>
+    <w:p>
+      <w:pPr>
+        <w:rPr>
+          <w:lang w:val="en-US"/>
+        </w:rPr>
+      </w:pPr>
+      <w:r>
+        <w:rPr>
+          <w:lang w:val="en-US"/>
+        </w:rPr>
+        <w:t>using namespace std;</w:t>
+      </w:r>
+    </w:p>
+    <w:p>
+      <w:pPr>
+        <w:rPr>
+          <w:lang w:val="en-US"/>
+        </w:rPr>
+      </w:pPr>
+    </w:p>
+    <w:p>
+      <w:pPr>
+        <w:rPr>
+          <w:lang w:val="en-US"/>
+        </w:rPr>
+      </w:pPr>
+      <w:r>
+        <w:rPr>
+          <w:lang w:val="en-US"/>
+        </w:rPr>
+        <w:t xml:space="preserve">struct </w:t>
+      </w:r>
+      <w:proofErr w:type="spellStart"/>
+      <w:proofErr w:type="gramStart"/>
+      <w:r>
+        <w:rPr>
+          <w:lang w:val="en-US"/>
+        </w:rPr>
+        <w:t>Cliente</w:t>
+      </w:r>
+      <w:proofErr w:type="spellEnd"/>
+      <w:r>
+        <w:rPr>
+          <w:lang w:val="en-US"/>
+        </w:rPr>
+        <w:t>{</w:t>
+      </w:r>
+      <w:proofErr w:type="gramEnd"/>
+    </w:p>
+    <w:p>
+      <w:pPr>
+        <w:rPr>
+          <w:lang w:val="en-US"/>
+        </w:rPr>
+      </w:pPr>
+      <w:r>
+        <w:rPr>
+          <w:lang w:val="en-US"/>
+        </w:rPr>
+        <w:t xml:space="preserve">    int </w:t>
+      </w:r>
+      <w:proofErr w:type="spellStart"/>
+      <w:r>
+        <w:rPr>
+          <w:lang w:val="en-US"/>
+        </w:rPr>
+        <w:t>numeroCuenta</w:t>
+      </w:r>
+      <w:proofErr w:type="spellEnd"/>
+      <w:r>
+        <w:rPr>
+          <w:lang w:val="en-US"/>
+        </w:rPr>
+        <w:t>;</w:t>
+      </w:r>
+    </w:p>
+    <w:p>
+      <w:pPr>
+        <w:rPr>
+          <w:lang w:val="en-US"/>
+        </w:rPr>
+      </w:pPr>
+      <w:r>
+        <w:rPr>
+          <w:lang w:val="en-US"/>
+        </w:rPr>
+        <w:t xml:space="preserve">    string </w:t>
+      </w:r>
+      <w:proofErr w:type="spellStart"/>
+      <w:r>
+        <w:rPr>
+          <w:lang w:val="en-US"/>
+        </w:rPr>
+        <w:t>nombre</w:t>
+      </w:r>
+      <w:proofErr w:type="spellEnd"/>
+      <w:r>
+        <w:rPr>
+          <w:lang w:val="en-US"/>
+        </w:rPr>
+        <w:t>;</w:t>
+      </w:r>
+    </w:p>
+    <w:p>
+      <w:r>
+        <w:rPr>
+          <w:lang w:val="en-US"/>
+        </w:rPr>
+        <w:t xml:space="preserve">    </w:t>
+      </w:r>
+      <w:proofErr w:type="spellStart"/>
+      <w:r>
+        <w:t>double</w:t>
+      </w:r>
+      <w:proofErr w:type="spellEnd"/>
+      <w:r>
+        <w:t xml:space="preserve"> saldo;</w:t>
+      </w:r>
+    </w:p>
+    <w:p>
+      <w:r>
+        <w:t>    Cliente* siguiente;</w:t>
+      </w:r>
+    </w:p>
+    <w:p>
+      <w:r>
+        <w:t>};</w:t>
+      </w:r>
+    </w:p>
+    <w:p/>
+    <w:p>
+      <w:proofErr w:type="spellStart"/>
+      <w:r>
+        <w:t>void</w:t>
+      </w:r>
+      <w:proofErr w:type="spellEnd"/>
+      <w:r>
+        <w:t xml:space="preserve"> </w:t>
+      </w:r>
+      <w:proofErr w:type="spellStart"/>
+      <w:proofErr w:type="gramStart"/>
+      <w:r>
+        <w:t>insertarCliente</w:t>
+      </w:r>
+      <w:proofErr w:type="spellEnd"/>
+      <w:r>
+        <w:t>(</w:t>
+      </w:r>
+      <w:proofErr w:type="gramEnd"/>
+      <w:r>
+        <w:t xml:space="preserve">Cliente*&amp; cabeza, </w:t>
+      </w:r>
+      <w:proofErr w:type="spellStart"/>
+      <w:r>
+        <w:t>int</w:t>
+      </w:r>
+      <w:proofErr w:type="spellEnd"/>
+      <w:r>
+        <w:t xml:space="preserve"> </w:t>
+      </w:r>
+      <w:proofErr w:type="spellStart"/>
+      <w:r>
+        <w:t>numeroCuenta</w:t>
+      </w:r>
+      <w:proofErr w:type="spellEnd"/>
+      <w:r>
+        <w:t xml:space="preserve">, </w:t>
+      </w:r>
+      <w:proofErr w:type="spellStart"/>
+      <w:r>
+        <w:t>string</w:t>
+      </w:r>
+      <w:proofErr w:type="spellEnd"/>
+      <w:r>
+        <w:t xml:space="preserve"> nombre, </w:t>
+      </w:r>
+      <w:proofErr w:type="spellStart"/>
+      <w:r>
+        <w:t>double</w:t>
+      </w:r>
+      <w:proofErr w:type="spellEnd"/>
+      <w:r>
+        <w:t xml:space="preserve"> </w:t>
+      </w:r>
+      <w:proofErr w:type="gramStart"/>
+      <w:r>
+        <w:t>saldo){</w:t>
+      </w:r>
+      <w:proofErr w:type="gramEnd"/>
+    </w:p>
+    <w:p>
+      <w:r>
+        <w:t xml:space="preserve">    Cliente* nuevo = new </w:t>
+      </w:r>
+      <w:proofErr w:type="gramStart"/>
+      <w:r>
+        <w:t>Cliente(</w:t>
+      </w:r>
+      <w:proofErr w:type="gramEnd"/>
+      <w:r>
+        <w:t>);</w:t>
+      </w:r>
+    </w:p>
+    <w:p>
+      <w:r>
+        <w:t xml:space="preserve">    nuevo -&gt; </w:t>
+      </w:r>
+      <w:proofErr w:type="spellStart"/>
+      <w:r>
+        <w:t>numeroCuenta</w:t>
+      </w:r>
+      <w:proofErr w:type="spellEnd"/>
+      <w:r>
+        <w:t xml:space="preserve"> = </w:t>
+      </w:r>
+      <w:proofErr w:type="spellStart"/>
+      <w:r>
+        <w:t>numeroCuenta</w:t>
+      </w:r>
+      <w:proofErr w:type="spellEnd"/>
+      <w:r>
+        <w:t>;</w:t>
+      </w:r>
+    </w:p>
+    <w:p>
+      <w:r>
+        <w:t>    nuevo -&gt; nombre = nombre;</w:t>
+      </w:r>
+    </w:p>
+    <w:p>
+      <w:r>
+        <w:t>    nuevo -&gt; saldo = saldo;</w:t>
+      </w:r>
+    </w:p>
+    <w:p>
+      <w:r>
+        <w:t xml:space="preserve">    nuevo -&gt; siguiente = </w:t>
+      </w:r>
+      <w:proofErr w:type="spellStart"/>
+      <w:r>
+        <w:t>nullptr</w:t>
+      </w:r>
+      <w:proofErr w:type="spellEnd"/>
+      <w:r>
+        <w:t>;</w:t>
+      </w:r>
+    </w:p>
+    <w:p/>
+    <w:p>
+      <w:r>
+        <w:t xml:space="preserve">    </w:t>
+      </w:r>
+      <w:proofErr w:type="spellStart"/>
+      <w:proofErr w:type="gramStart"/>
+      <w:r>
+        <w:t>if</w:t>
+      </w:r>
+      <w:proofErr w:type="spellEnd"/>
+      <w:r>
+        <w:t>(</w:t>
+      </w:r>
+      <w:proofErr w:type="gramEnd"/>
+      <w:r>
+        <w:t xml:space="preserve">cabeza == </w:t>
+      </w:r>
+      <w:proofErr w:type="spellStart"/>
+      <w:proofErr w:type="gramStart"/>
+      <w:r>
+        <w:t>nullptr</w:t>
+      </w:r>
+      <w:proofErr w:type="spellEnd"/>
+      <w:r>
+        <w:t>){</w:t>
+      </w:r>
+      <w:proofErr w:type="gramEnd"/>
+    </w:p>
+    <w:p>
+      <w:r>
+        <w:t>        cabeza = nuevo;</w:t>
+      </w:r>
+    </w:p>
+    <w:p>
+      <w:r>
+        <w:t xml:space="preserve">    } </w:t>
+      </w:r>
+      <w:proofErr w:type="spellStart"/>
+      <w:r>
+        <w:t>else</w:t>
+      </w:r>
+      <w:proofErr w:type="spellEnd"/>
+      <w:r>
+        <w:t xml:space="preserve"> {</w:t>
+      </w:r>
+    </w:p>
+    <w:p>
+      <w:r>
+        <w:t>        Cliente* actual = cabeza;</w:t>
+      </w:r>
+    </w:p>
+    <w:p>
+      <w:r>
+        <w:t xml:space="preserve">        </w:t>
+      </w:r>
+      <w:proofErr w:type="spellStart"/>
+      <w:proofErr w:type="gramStart"/>
+      <w:r>
+        <w:t>while</w:t>
+      </w:r>
+      <w:proofErr w:type="spellEnd"/>
+      <w:r>
+        <w:t>(</w:t>
+      </w:r>
+      <w:proofErr w:type="gramEnd"/>
+      <w:r>
+        <w:t xml:space="preserve">actual -&gt; </w:t>
+      </w:r>
+      <w:proofErr w:type="gramStart"/>
+      <w:r>
+        <w:t>siguiente !</w:t>
+      </w:r>
+      <w:proofErr w:type="gramEnd"/>
+      <w:r>
+        <w:t xml:space="preserve">= </w:t>
+      </w:r>
+      <w:proofErr w:type="spellStart"/>
+      <w:proofErr w:type="gramStart"/>
+      <w:r>
+        <w:t>nullptr</w:t>
+      </w:r>
+      <w:proofErr w:type="spellEnd"/>
+      <w:r>
+        <w:t>){</w:t>
+      </w:r>
+      <w:proofErr w:type="gramEnd"/>
+    </w:p>
+    <w:p>
+      <w:r>
+        <w:t>            actual = actual -&gt; siguiente;</w:t>
+      </w:r>
+    </w:p>
+    <w:p>
+      <w:r>
+        <w:t>        }</w:t>
+      </w:r>
+    </w:p>
+    <w:p>
+      <w:r>
+        <w:t>        actual -&gt; siguiente = nuevo;</w:t>
+      </w:r>
+    </w:p>
+    <w:p>
+      <w:r>
+        <w:t>    }</w:t>
+      </w:r>
+    </w:p>
+    <w:p>
+      <w:r>
+        <w:t>}</w:t>
+      </w:r>
+    </w:p>
+    <w:p/>
+    <w:p>
+      <w:proofErr w:type="spellStart"/>
+      <w:r>
+        <w:t>void</w:t>
+      </w:r>
+      <w:proofErr w:type="spellEnd"/>
+      <w:r>
+        <w:t xml:space="preserve"> </w:t>
+      </w:r>
+      <w:proofErr w:type="spellStart"/>
+      <w:proofErr w:type="gramStart"/>
+      <w:r>
+        <w:t>mostrarClientes</w:t>
+      </w:r>
+      <w:proofErr w:type="spellEnd"/>
+      <w:r>
+        <w:t>(</w:t>
+      </w:r>
+      <w:proofErr w:type="gramEnd"/>
+      <w:r>
+        <w:t xml:space="preserve">Cliente* </w:t>
+      </w:r>
+      <w:proofErr w:type="gramStart"/>
+      <w:r>
+        <w:t>cabeza){</w:t>
+      </w:r>
+      <w:proofErr w:type="gramEnd"/>
+    </w:p>
+    <w:p>
+      <w:r>
+        <w:lastRenderedPageBreak/>
+        <w:t xml:space="preserve">    </w:t>
+      </w:r>
+      <w:proofErr w:type="spellStart"/>
+      <w:r>
+        <w:t>cout</w:t>
+      </w:r>
+      <w:proofErr w:type="spellEnd"/>
+      <w:r>
+        <w:t>&lt;&lt;"\n--- Lista de Clientes del Banco ---"&lt;&lt;</w:t>
+      </w:r>
+      <w:proofErr w:type="spellStart"/>
+      <w:r>
+        <w:t>endl</w:t>
+      </w:r>
+      <w:proofErr w:type="spellEnd"/>
+      <w:r>
+        <w:t>;</w:t>
+      </w:r>
+    </w:p>
+    <w:p>
+      <w:r>
+        <w:t>    Cliente* actual = cabeza;</w:t>
+      </w:r>
+    </w:p>
+    <w:p/>
+    <w:p>
+      <w:r>
+        <w:t xml:space="preserve">    </w:t>
+      </w:r>
+      <w:proofErr w:type="spellStart"/>
+      <w:proofErr w:type="gramStart"/>
+      <w:r>
+        <w:t>while</w:t>
+      </w:r>
+      <w:proofErr w:type="spellEnd"/>
+      <w:r>
+        <w:t>(actual !</w:t>
+      </w:r>
+      <w:proofErr w:type="gramEnd"/>
+      <w:r>
+        <w:t xml:space="preserve">= </w:t>
+      </w:r>
+      <w:proofErr w:type="spellStart"/>
+      <w:proofErr w:type="gramStart"/>
+      <w:r>
+        <w:t>nullptr</w:t>
+      </w:r>
+      <w:proofErr w:type="spellEnd"/>
+      <w:r>
+        <w:t>){</w:t>
+      </w:r>
+      <w:proofErr w:type="gramEnd"/>
+    </w:p>
+    <w:p>
+      <w:r>
+        <w:t xml:space="preserve">        </w:t>
+      </w:r>
+      <w:proofErr w:type="spellStart"/>
+      <w:r>
+        <w:t>cout</w:t>
+      </w:r>
+      <w:proofErr w:type="spellEnd"/>
+      <w:r>
+        <w:t>&lt;&lt;"</w:t>
+      </w:r>
+      <w:proofErr w:type="spellStart"/>
+      <w:r>
+        <w:t>Numero</w:t>
+      </w:r>
+      <w:proofErr w:type="spellEnd"/>
+      <w:r>
+        <w:t xml:space="preserve"> de Cuenta: "&lt;&lt;actual -&gt; </w:t>
+      </w:r>
+      <w:proofErr w:type="spellStart"/>
+      <w:r>
+        <w:t>numeroCuenta</w:t>
+      </w:r>
+      <w:proofErr w:type="spellEnd"/>
+    </w:p>
+    <w:p>
+      <w:r>
+        <w:t>            &lt;&lt;" | Nombre: "&lt;&lt;actual -&gt; nombre</w:t>
+      </w:r>
+    </w:p>
+    <w:p>
+      <w:r>
+        <w:t>            &lt;&lt;" | Saldo: "&lt;&lt;actual -&gt; saldo&lt;&lt;" Gs."&lt;&lt;</w:t>
+      </w:r>
+      <w:proofErr w:type="spellStart"/>
+      <w:r>
+        <w:t>endl</w:t>
+      </w:r>
+      <w:proofErr w:type="spellEnd"/>
+      <w:r>
+        <w:t>;</w:t>
+      </w:r>
+    </w:p>
+    <w:p/>
+    <w:p>
+      <w:r>
+        <w:t>        actual = actual -&gt; siguiente;</w:t>
+      </w:r>
+    </w:p>
+    <w:p>
+      <w:r>
+        <w:t>    }</w:t>
+      </w:r>
+    </w:p>
+    <w:p>
+      <w:r>
+        <w:t>}</w:t>
+      </w:r>
+    </w:p>
+    <w:p/>
+    <w:p>
+      <w:proofErr w:type="spellStart"/>
+      <w:r>
+        <w:t>int</w:t>
+      </w:r>
+      <w:proofErr w:type="spellEnd"/>
+      <w:r>
+        <w:t xml:space="preserve"> </w:t>
+      </w:r>
+      <w:proofErr w:type="spellStart"/>
+      <w:proofErr w:type="gramStart"/>
+      <w:r>
+        <w:t>main</w:t>
+      </w:r>
+      <w:proofErr w:type="spellEnd"/>
+      <w:r>
+        <w:t>(){</w:t>
+      </w:r>
+      <w:proofErr w:type="gramEnd"/>
+    </w:p>
+    <w:p>
+      <w:r>
+        <w:t xml:space="preserve">    Cliente* lista = </w:t>
+      </w:r>
+      <w:proofErr w:type="spellStart"/>
+      <w:r>
+        <w:t>nullptr</w:t>
+      </w:r>
+      <w:proofErr w:type="spellEnd"/>
+      <w:r>
+        <w:t>;</w:t>
+      </w:r>
+    </w:p>
+    <w:p>
+      <w:r>
+        <w:t xml:space="preserve">    </w:t>
+      </w:r>
+      <w:proofErr w:type="spellStart"/>
+      <w:r>
+        <w:t>int</w:t>
+      </w:r>
+      <w:proofErr w:type="spellEnd"/>
+      <w:r>
+        <w:t xml:space="preserve"> n;</w:t>
+      </w:r>
+    </w:p>
+    <w:p/>
+    <w:p>
+      <w:pPr>
+        <w:rPr>
+          <w:lang w:val="en-US"/>
+        </w:rPr>
+      </w:pPr>
+      <w:r>
+        <w:t xml:space="preserve">    </w:t>
+      </w:r>
+      <w:proofErr w:type="spellStart"/>
+      <w:r>
+        <w:t>cout</w:t>
+      </w:r>
+      <w:proofErr w:type="spellEnd"/>
+      <w:r>
+        <w:t xml:space="preserve">&lt;&lt;"Cuantos clientes desea registrar? </w:t>
+      </w:r>
+      <w:r>
+        <w:rPr>
+          <w:lang w:val="en-US"/>
+        </w:rPr>
+        <w:t>";</w:t>
+      </w:r>
+    </w:p>
+    <w:p>
+      <w:pPr>
+        <w:rPr>
+          <w:lang w:val="en-US"/>
+        </w:rPr>
+      </w:pPr>
+      <w:r>
+        <w:rPr>
+          <w:lang w:val="en-US"/>
+        </w:rPr>
+        <w:t xml:space="preserve">    </w:t>
+      </w:r>
+      <w:proofErr w:type="spellStart"/>
+      <w:r>
+        <w:rPr>
+          <w:lang w:val="en-US"/>
+        </w:rPr>
+        <w:t>cin</w:t>
+      </w:r>
+      <w:proofErr w:type="spellEnd"/>
+      <w:r>
+        <w:rPr>
+          <w:lang w:val="en-US"/>
+        </w:rPr>
+        <w:t>&gt;&gt;n;</w:t>
+      </w:r>
+    </w:p>
+    <w:p>
+      <w:pPr>
+        <w:rPr>
+          <w:lang w:val="en-US"/>
+        </w:rPr>
+      </w:pPr>
+      <w:r>
+        <w:rPr>
+          <w:lang w:val="en-US"/>
+        </w:rPr>
+        <w:t xml:space="preserve">    </w:t>
+      </w:r>
+      <w:proofErr w:type="spellStart"/>
+      <w:proofErr w:type="gramStart"/>
+      <w:r>
+        <w:rPr>
+          <w:lang w:val="en-US"/>
+        </w:rPr>
+        <w:t>cin.ignore</w:t>
+      </w:r>
+      <w:proofErr w:type="spellEnd"/>
+      <w:proofErr w:type="gramEnd"/>
+      <w:r>
+        <w:rPr>
+          <w:lang w:val="en-US"/>
+        </w:rPr>
+        <w:t>();</w:t>
+      </w:r>
+    </w:p>
+    <w:p>
+      <w:pPr>
+        <w:rPr>
+          <w:lang w:val="en-US"/>
+        </w:rPr>
+      </w:pPr>
+    </w:p>
+    <w:p>
+      <w:pPr>
+        <w:rPr>
+          <w:lang w:val="en-US"/>
+        </w:rPr>
+      </w:pPr>
+      <w:r>
+        <w:rPr>
+          <w:lang w:val="en-US"/>
+        </w:rPr>
+        <w:t xml:space="preserve">    </w:t>
+      </w:r>
+      <w:proofErr w:type="gramStart"/>
+      <w:r>
+        <w:rPr>
+          <w:lang w:val="en-US"/>
+        </w:rPr>
+        <w:t>for(</w:t>
+      </w:r>
+      <w:proofErr w:type="gramEnd"/>
+      <w:r>
+        <w:rPr>
+          <w:lang w:val="en-US"/>
+        </w:rPr>
+        <w:t xml:space="preserve">int </w:t>
+      </w:r>
+      <w:proofErr w:type="spellStart"/>
+      <w:r>
+        <w:rPr>
+          <w:lang w:val="en-US"/>
+        </w:rPr>
+        <w:t>i</w:t>
+      </w:r>
+      <w:proofErr w:type="spellEnd"/>
+      <w:r>
+        <w:rPr>
+          <w:lang w:val="en-US"/>
+        </w:rPr>
+        <w:t xml:space="preserve"> = 0; </w:t>
+      </w:r>
+      <w:proofErr w:type="spellStart"/>
+      <w:r>
+        <w:rPr>
+          <w:lang w:val="en-US"/>
+        </w:rPr>
+        <w:t>i</w:t>
+      </w:r>
+      <w:proofErr w:type="spellEnd"/>
+      <w:r>
+        <w:rPr>
+          <w:lang w:val="en-US"/>
+        </w:rPr>
+        <w:t xml:space="preserve">&lt;n; </w:t>
+      </w:r>
+      <w:proofErr w:type="spellStart"/>
+      <w:r>
+        <w:rPr>
+          <w:lang w:val="en-US"/>
+        </w:rPr>
+        <w:t>i</w:t>
+      </w:r>
+      <w:proofErr w:type="spellEnd"/>
+      <w:r>
+        <w:rPr>
+          <w:lang w:val="en-US"/>
+        </w:rPr>
+        <w:t>+</w:t>
+      </w:r>
+      <w:proofErr w:type="gramStart"/>
+      <w:r>
+        <w:rPr>
+          <w:lang w:val="en-US"/>
+        </w:rPr>
+        <w:t>+){</w:t>
+      </w:r>
+      <w:proofErr w:type="gramEnd"/>
+    </w:p>
+    <w:p>
+      <w:pPr>
+        <w:rPr>
+          <w:lang w:val="en-US"/>
+        </w:rPr>
+      </w:pPr>
+      <w:r>
+        <w:rPr>
+          <w:lang w:val="en-US"/>
+        </w:rPr>
+        <w:t xml:space="preserve">        int </w:t>
+      </w:r>
+      <w:proofErr w:type="spellStart"/>
+      <w:r>
+        <w:rPr>
+          <w:lang w:val="en-US"/>
+        </w:rPr>
+        <w:t>numeroCuenta</w:t>
+      </w:r>
+      <w:proofErr w:type="spellEnd"/>
+      <w:r>
+        <w:rPr>
+          <w:lang w:val="en-US"/>
+        </w:rPr>
+        <w:t>;</w:t>
+      </w:r>
+    </w:p>
+    <w:p>
+      <w:pPr>
+        <w:rPr>
+          <w:lang w:val="en-US"/>
+        </w:rPr>
+      </w:pPr>
+      <w:r>
+        <w:rPr>
+          <w:lang w:val="en-US"/>
+        </w:rPr>
+        <w:t xml:space="preserve">        double </w:t>
+      </w:r>
+      <w:proofErr w:type="spellStart"/>
+      <w:r>
+        <w:rPr>
+          <w:lang w:val="en-US"/>
+        </w:rPr>
+        <w:t>saldo</w:t>
+      </w:r>
+      <w:proofErr w:type="spellEnd"/>
+      <w:r>
+        <w:rPr>
+          <w:lang w:val="en-US"/>
+        </w:rPr>
+        <w:t>;</w:t>
+      </w:r>
+    </w:p>
+    <w:p>
+      <w:pPr>
+        <w:rPr>
+          <w:lang w:val="en-US"/>
+        </w:rPr>
+      </w:pPr>
+      <w:r>
+        <w:rPr>
+          <w:lang w:val="en-US"/>
+        </w:rPr>
+        <w:t xml:space="preserve">        string </w:t>
+      </w:r>
+      <w:proofErr w:type="spellStart"/>
+      <w:r>
+        <w:rPr>
+          <w:lang w:val="en-US"/>
+        </w:rPr>
+        <w:t>nombre</w:t>
+      </w:r>
+      <w:proofErr w:type="spellEnd"/>
+      <w:r>
+        <w:rPr>
+          <w:lang w:val="en-US"/>
+        </w:rPr>
+        <w:t>;</w:t>
+      </w:r>
+    </w:p>
+    <w:p>
+      <w:pPr>
+        <w:rPr>
+          <w:lang w:val="en-US"/>
+        </w:rPr>
+      </w:pPr>
+    </w:p>
+    <w:p>
+      <w:r>
+        <w:rPr>
+          <w:lang w:val="en-US"/>
+        </w:rPr>
+        <w:t xml:space="preserve">        </w:t>
+      </w:r>
+      <w:proofErr w:type="spellStart"/>
+      <w:r>
+        <w:t>cout</w:t>
+      </w:r>
+      <w:proofErr w:type="spellEnd"/>
+      <w:r>
+        <w:t>&lt;&lt;"\</w:t>
+      </w:r>
+      <w:proofErr w:type="spellStart"/>
+      <w:r>
+        <w:t>nCliente</w:t>
+      </w:r>
+      <w:proofErr w:type="spellEnd"/>
+      <w:r>
+        <w:t xml:space="preserve"> "&lt;&lt;i+1&lt;&lt;</w:t>
+      </w:r>
+      <w:proofErr w:type="spellStart"/>
+      <w:r>
+        <w:t>endl</w:t>
+      </w:r>
+      <w:proofErr w:type="spellEnd"/>
+      <w:r>
+        <w:t>;</w:t>
+      </w:r>
+    </w:p>
+    <w:p/>
+    <w:p>
+      <w:r>
+        <w:t xml:space="preserve">        </w:t>
+      </w:r>
+      <w:proofErr w:type="spellStart"/>
+      <w:r>
+        <w:t>cout</w:t>
+      </w:r>
+      <w:proofErr w:type="spellEnd"/>
+      <w:r>
+        <w:t>&lt;&lt;"</w:t>
+      </w:r>
+      <w:proofErr w:type="spellStart"/>
+      <w:r>
+        <w:t>Numero</w:t>
+      </w:r>
+      <w:proofErr w:type="spellEnd"/>
+      <w:r>
+        <w:t xml:space="preserve"> de Cuenta: ";</w:t>
+      </w:r>
+    </w:p>
+    <w:p>
+      <w:r>
+        <w:t xml:space="preserve">        </w:t>
+      </w:r>
+      <w:proofErr w:type="spellStart"/>
+      <w:r>
+        <w:t>cin</w:t>
+      </w:r>
+      <w:proofErr w:type="spellEnd"/>
+      <w:r>
+        <w:t>&gt;&gt;</w:t>
+      </w:r>
+      <w:proofErr w:type="spellStart"/>
+      <w:r>
+        <w:t>numeroCuenta</w:t>
+      </w:r>
+      <w:proofErr w:type="spellEnd"/>
+      <w:r>
+        <w:t>;</w:t>
+      </w:r>
+    </w:p>
+    <w:p>
+      <w:r>
+        <w:t xml:space="preserve">        </w:t>
+      </w:r>
+      <w:proofErr w:type="spellStart"/>
+      <w:proofErr w:type="gramStart"/>
+      <w:r>
+        <w:t>cin.ignore</w:t>
+      </w:r>
+      <w:proofErr w:type="spellEnd"/>
+      <w:proofErr w:type="gramEnd"/>
+      <w:r>
+        <w:t>();</w:t>
+      </w:r>
+    </w:p>
+    <w:p/>
+    <w:p>
+      <w:r>
+        <w:lastRenderedPageBreak/>
+        <w:t>        cout&lt;&lt;"Nombre: ";</w:t>
+      </w:r>
+    </w:p>
+    <w:p>
+      <w:pPr>
+        <w:rPr>
+          <w:lang w:val="en-US"/>
+        </w:rPr>
+      </w:pPr>
+      <w:r>
+        <w:t xml:space="preserve">        </w:t>
+      </w:r>
+      <w:proofErr w:type="spellStart"/>
+      <w:proofErr w:type="gramStart"/>
+      <w:r>
+        <w:rPr>
+          <w:lang w:val="en-US"/>
+        </w:rPr>
+        <w:t>getline</w:t>
+      </w:r>
+      <w:proofErr w:type="spellEnd"/>
+      <w:r>
+        <w:rPr>
+          <w:lang w:val="en-US"/>
+        </w:rPr>
+        <w:t>(</w:t>
+      </w:r>
+      <w:proofErr w:type="spellStart"/>
+      <w:proofErr w:type="gramEnd"/>
+      <w:r>
+        <w:rPr>
+          <w:lang w:val="en-US"/>
+        </w:rPr>
+        <w:t>cin</w:t>
+      </w:r>
+      <w:proofErr w:type="spellEnd"/>
+      <w:r>
+        <w:rPr>
+          <w:lang w:val="en-US"/>
+        </w:rPr>
+        <w:t xml:space="preserve">, </w:t>
+      </w:r>
+      <w:proofErr w:type="spellStart"/>
+      <w:r>
+        <w:rPr>
+          <w:lang w:val="en-US"/>
+        </w:rPr>
+        <w:t>nombre</w:t>
+      </w:r>
+      <w:proofErr w:type="spellEnd"/>
+      <w:r>
+        <w:rPr>
+          <w:lang w:val="en-US"/>
+        </w:rPr>
+        <w:t>);</w:t>
+      </w:r>
+    </w:p>
+    <w:p>
+      <w:pPr>
+        <w:rPr>
+          <w:lang w:val="en-US"/>
+        </w:rPr>
+      </w:pPr>
+    </w:p>
+    <w:p>
+      <w:pPr>
+        <w:rPr>
+          <w:lang w:val="en-US"/>
+        </w:rPr>
+      </w:pPr>
+      <w:r>
+        <w:rPr>
+          <w:lang w:val="en-US"/>
+        </w:rPr>
+        <w:t xml:space="preserve">        </w:t>
+      </w:r>
+      <w:proofErr w:type="spellStart"/>
+      <w:r>
+        <w:rPr>
+          <w:lang w:val="en-US"/>
+        </w:rPr>
+        <w:t>cout</w:t>
+      </w:r>
+      <w:proofErr w:type="spellEnd"/>
+      <w:r>
+        <w:rPr>
+          <w:lang w:val="en-US"/>
+        </w:rPr>
+        <w:t>&lt;&lt;"Saldo: ";</w:t>
+      </w:r>
+    </w:p>
+    <w:p>
+      <w:r>
+        <w:rPr>
+          <w:lang w:val="en-US"/>
+        </w:rPr>
+        <w:t xml:space="preserve">        </w:t>
+      </w:r>
+      <w:proofErr w:type="spellStart"/>
+      <w:r>
+        <w:t>cin</w:t>
+      </w:r>
+      <w:proofErr w:type="spellEnd"/>
+      <w:r>
+        <w:t>&gt;&gt;saldo;</w:t>
+      </w:r>
+    </w:p>
+    <w:p>
+      <w:r>
+        <w:t xml:space="preserve">        </w:t>
+      </w:r>
+      <w:proofErr w:type="spellStart"/>
+      <w:proofErr w:type="gramStart"/>
+      <w:r>
+        <w:t>cin.ignore</w:t>
+      </w:r>
+      <w:proofErr w:type="spellEnd"/>
+      <w:proofErr w:type="gramEnd"/>
+      <w:r>
+        <w:t>();</w:t>
+      </w:r>
+    </w:p>
+    <w:p/>
+    <w:p>
+      <w:r>
+        <w:t xml:space="preserve">        </w:t>
+      </w:r>
+      <w:proofErr w:type="spellStart"/>
+      <w:proofErr w:type="gramStart"/>
+      <w:r>
+        <w:t>insertarCliente</w:t>
+      </w:r>
+      <w:proofErr w:type="spellEnd"/>
+      <w:r>
+        <w:t>(</w:t>
+      </w:r>
+      <w:proofErr w:type="gramEnd"/>
+      <w:r>
+        <w:t xml:space="preserve">lista, </w:t>
+      </w:r>
+      <w:proofErr w:type="spellStart"/>
+      <w:r>
+        <w:t>numeroCuenta</w:t>
+      </w:r>
+      <w:proofErr w:type="spellEnd"/>
+      <w:r>
+        <w:t>, nombre, saldo);</w:t>
+      </w:r>
+    </w:p>
+    <w:p>
+      <w:r>
+        <w:t>    }</w:t>
+      </w:r>
+    </w:p>
+    <w:p/>
+    <w:p>
+      <w:r>
+        <w:t xml:space="preserve">    </w:t>
+      </w:r>
+      <w:proofErr w:type="spellStart"/>
+      <w:r>
+        <w:t>mostrarClientes</w:t>
+      </w:r>
+      <w:proofErr w:type="spellEnd"/>
+      <w:r>
+        <w:t>(lista);</w:t>
+      </w:r>
+    </w:p>
+    <w:p/>
+    <w:p>
+      <w:r>
+        <w:t xml:space="preserve">    </w:t>
+      </w:r>
+      <w:proofErr w:type="spellStart"/>
+      <w:r>
+        <w:t>return</w:t>
+      </w:r>
+      <w:proofErr w:type="spellEnd"/>
+      <w:r>
+        <w:t xml:space="preserve"> 0;</w:t>
+      </w:r>
+    </w:p>
+    <w:p>
+      <w:r>
+        <w:t>}</w:t>
+      </w:r>
+    </w:p>
+    <w:p>
+      <w:pPr>
+        <w:rPr>
+          <w:b/>
+          <w:bCs/>
+        </w:rPr>
+      </w:pPr>
+    </w:p>
+    <w:p>
+      <w:pPr>
+        <w:rPr>
+          <w:b/>
+          <w:bCs/>
+        </w:rPr>
+      </w:pPr>
+      <w:r>
+        <w:rPr>
+          <w:b/>
+          <w:bCs/>
+          <w:noProof/>
+        </w:rPr>
+        <w:drawing>
+          <wp:inline distT="0" distB="0" distL="0" distR="0" wp14:anchorId="4B237E9E" wp14:editId="73530926">
+            <wp:extent cx="5400040" cy="3024505"/>
+            <wp:effectExtent l="0" t="0" r="0" b="4445"/>
+            <wp:docPr id="1640367447" name="Imagen 1"/>
+            <wp:cNvGraphicFramePr>
+              <a:graphicFrameLocks xmlns:a="http://schemas.openxmlformats.org/drawingml/2006/main" noChangeAspect="1"/>
+            </wp:cNvGraphicFramePr>
+            <a:graphic xmlns:a="http://schemas.openxmlformats.org/drawingml/2006/main">
+              <a:graphicData uri="http://schemas.openxmlformats.org/drawingml/2006/picture">
+                <pic:pic xmlns:pic="http://schemas.openxmlformats.org/drawingml/2006/picture">
+                  <pic:nvPicPr>
+                    <pic:cNvPr id="1640367447" name=""/>
+                    <pic:cNvPicPr/>
+                  </pic:nvPicPr>
+                  <pic:blipFill>
+                    <a:blip r:embed="rId5"/>
+                    <a:stretch>
+                      <a:fillRect/>
+                    </a:stretch>
+                  </pic:blipFill>
+                  <pic:spPr>
+                    <a:xfrm>
+                      <a:off x="0" y="0"/>
+                      <a:ext cx="5400040" cy="3024505"/>
+                    </a:xfrm>
+                    <a:prstGeom prst="rect">
+                      <a:avLst/>
+                    </a:prstGeom>
+                  </pic:spPr>
+                </pic:pic>
+              </a:graphicData>
+            </a:graphic>
+          </wp:inline>
+        </w:drawing>
+      </w:r>
     </w:p>
     <w:sectPr>
       <w:pgSz w:w="11906" w:h="16838"/>
@@ -1841,6 +2997,7 @@
   <w:style w:type="character" w:default="1" w:styleId="Fuentedeprrafopredeter">
     <w:name w:val="Default Paragraph Font"/>
     <w:uiPriority w:val="1"/>
+    <w:semiHidden/>
     <w:unhideWhenUsed/>
   </w:style>
   <w:style w:type="table" w:default="1" w:styleId="Tablanormal">

</xml_diff>